<commit_message>
Updating hw 3, adding hw 2 template
</commit_message>
<xml_diff>
--- a/homework/hw-03_MH.docx
+++ b/homework/hw-03_MH.docx
@@ -58,7 +58,219 @@
         <w:pStyle w:val="FirstParagraph"/>
       </w:pPr>
       <w:r>
-        <w:t xml:space="preserve">For this assignment you will begin a new Quarto file. To do this, go to RStudio and click File &gt; New File &gt; Quarto Document. A pop-up will appear asking for a title, author, and format. You may leave these as the default options for now. Click OK and a new file will open. Update the YAML with your title, name, and date.</w:t>
+        <w:t xml:space="preserve">For this assignment (and all future assignments) you will begin a new Quarto file. To do this, open RStudio and make sure you are inside your course project folder with File &gt; Open Project &gt; …. To create a new Quarto file, go to the top menu and click File &gt; New File &gt; Quarto Document. A pop-up will appear asking for a title, author, and format. You may leave these as the default options for now. Click OK and a new file will open.</w:t>
+      </w:r>
+    </w:p>
+    <w:p>
+      <w:pPr>
+        <w:pStyle w:val="BodyText"/>
+      </w:pPr>
+      <w:r>
+        <w:t xml:space="preserve">In the document, Quarto automatically adds some starter text and code chunks. You may delete everything below the YAML header (everything under the second set of</w:t>
+      </w:r>
+      <w:r>
+        <w:t xml:space="preserve"> </w:t>
+      </w:r>
+      <w:r>
+        <w:rPr>
+          <w:rStyle w:val="VerbatimChar"/>
+        </w:rPr>
+        <w:t xml:space="preserve">---</w:t>
+      </w:r>
+      <w:r>
+        <w:t xml:space="preserve">). You should be left with just a YAML section at the very top, which looks something like this:</w:t>
+      </w:r>
+    </w:p>
+    <w:p>
+      <w:pPr>
+        <w:pStyle w:val="SourceCode"/>
+      </w:pPr>
+      <w:r>
+        <w:rPr>
+          <w:rStyle w:val="SpecialCharTok"/>
+        </w:rPr>
+        <w:t xml:space="preserve">---</w:t>
+      </w:r>
+      <w:r>
+        <w:br/>
+      </w:r>
+      <w:r>
+        <w:rPr>
+          <w:rStyle w:val="NormalTok"/>
+        </w:rPr>
+        <w:t xml:space="preserve">title</w:t>
+      </w:r>
+      <w:r>
+        <w:rPr>
+          <w:rStyle w:val="SpecialCharTok"/>
+        </w:rPr>
+        <w:t xml:space="preserve">:</w:t>
+      </w:r>
+      <w:r>
+        <w:rPr>
+          <w:rStyle w:val="NormalTok"/>
+        </w:rPr>
+        <w:t xml:space="preserve"> </w:t>
+      </w:r>
+      <w:r>
+        <w:rPr>
+          <w:rStyle w:val="StringTok"/>
+        </w:rPr>
+        <w:t xml:space="preserve">"Document Title"</w:t>
+      </w:r>
+      <w:r>
+        <w:br/>
+      </w:r>
+      <w:r>
+        <w:rPr>
+          <w:rStyle w:val="NormalTok"/>
+        </w:rPr>
+        <w:t xml:space="preserve">author</w:t>
+      </w:r>
+      <w:r>
+        <w:rPr>
+          <w:rStyle w:val="SpecialCharTok"/>
+        </w:rPr>
+        <w:t xml:space="preserve">:</w:t>
+      </w:r>
+      <w:r>
+        <w:rPr>
+          <w:rStyle w:val="NormalTok"/>
+        </w:rPr>
+        <w:t xml:space="preserve"> </w:t>
+      </w:r>
+      <w:r>
+        <w:rPr>
+          <w:rStyle w:val="StringTok"/>
+        </w:rPr>
+        <w:t xml:space="preserve">"Your Name"</w:t>
+      </w:r>
+      <w:r>
+        <w:br/>
+      </w:r>
+      <w:r>
+        <w:rPr>
+          <w:rStyle w:val="NormalTok"/>
+        </w:rPr>
+        <w:t xml:space="preserve">date</w:t>
+      </w:r>
+      <w:r>
+        <w:rPr>
+          <w:rStyle w:val="SpecialCharTok"/>
+        </w:rPr>
+        <w:t xml:space="preserve">:</w:t>
+      </w:r>
+      <w:r>
+        <w:rPr>
+          <w:rStyle w:val="NormalTok"/>
+        </w:rPr>
+        <w:t xml:space="preserve"> </w:t>
+      </w:r>
+      <w:r>
+        <w:rPr>
+          <w:rStyle w:val="StringTok"/>
+        </w:rPr>
+        <w:t xml:space="preserve">"2026-06-24"</w:t>
+      </w:r>
+      <w:r>
+        <w:br/>
+      </w:r>
+      <w:r>
+        <w:rPr>
+          <w:rStyle w:val="NormalTok"/>
+        </w:rPr>
+        <w:t xml:space="preserve">format</w:t>
+      </w:r>
+      <w:r>
+        <w:rPr>
+          <w:rStyle w:val="SpecialCharTok"/>
+        </w:rPr>
+        <w:t xml:space="preserve">:</w:t>
+      </w:r>
+      <w:r>
+        <w:rPr>
+          <w:rStyle w:val="NormalTok"/>
+        </w:rPr>
+        <w:t xml:space="preserve"> html</w:t>
+      </w:r>
+      <w:r>
+        <w:br/>
+      </w:r>
+      <w:r>
+        <w:rPr>
+          <w:rStyle w:val="SpecialCharTok"/>
+        </w:rPr>
+        <w:t xml:space="preserve">---</w:t>
+      </w:r>
+    </w:p>
+    <w:p>
+      <w:pPr>
+        <w:pStyle w:val="FirstParagraph"/>
+      </w:pPr>
+      <w:r>
+        <w:t xml:space="preserve">Now, Edit the YAML header. Change</w:t>
+      </w:r>
+    </w:p>
+    <w:p>
+      <w:pPr>
+        <w:numPr>
+          <w:ilvl w:val="0"/>
+          <w:numId w:val="1001"/>
+        </w:numPr>
+      </w:pPr>
+      <w:r>
+        <w:t xml:space="preserve">title -&gt; the assignment name (e.g. </w:t>
+      </w:r>
+      <w:r>
+        <w:rPr>
+          <w:rStyle w:val="VerbatimChar"/>
+        </w:rPr>
+        <w:t xml:space="preserve">HW 1</w:t>
+      </w:r>
+      <w:r>
+        <w:t xml:space="preserve">)</w:t>
+      </w:r>
+    </w:p>
+    <w:p>
+      <w:pPr>
+        <w:numPr>
+          <w:ilvl w:val="0"/>
+          <w:numId w:val="1001"/>
+        </w:numPr>
+      </w:pPr>
+      <w:r>
+        <w:t xml:space="preserve">author -&gt; your name</w:t>
+      </w:r>
+    </w:p>
+    <w:p>
+      <w:pPr>
+        <w:numPr>
+          <w:ilvl w:val="0"/>
+          <w:numId w:val="1001"/>
+        </w:numPr>
+      </w:pPr>
+      <w:r>
+        <w:t xml:space="preserve">date -&gt; today’s date</w:t>
+      </w:r>
+    </w:p>
+    <w:p>
+      <w:pPr>
+        <w:pStyle w:val="FirstParagraph"/>
+      </w:pPr>
+      <w:r>
+        <w:t xml:space="preserve">Now, save your file. Go to File &gt; Save as, and name it something clear like</w:t>
+      </w:r>
+      <w:r>
+        <w:t xml:space="preserve"> </w:t>
+      </w:r>
+      <w:r>
+        <w:rPr>
+          <w:rStyle w:val="VerbatimChar"/>
+        </w:rPr>
+        <w:t xml:space="preserve">hw1.qmd</w:t>
+      </w:r>
+      <w:r>
+        <w:t xml:space="preserve">. Keep it in your project folder. You’re ready to begin!</w:t>
       </w:r>
     </w:p>
     <w:bookmarkEnd w:id="10"/>
@@ -174,7 +386,7 @@
       <w:pPr>
         <w:numPr>
           <w:ilvl w:val="0"/>
-          <w:numId w:val="1001"/>
+          <w:numId w:val="1002"/>
         </w:numPr>
       </w:pPr>
       <w:r>
@@ -185,7 +397,7 @@
       <w:pPr>
         <w:numPr>
           <w:ilvl w:val="0"/>
-          <w:numId w:val="1001"/>
+          <w:numId w:val="1002"/>
         </w:numPr>
       </w:pPr>
       <w:r>
@@ -196,7 +408,7 @@
       <w:pPr>
         <w:numPr>
           <w:ilvl w:val="0"/>
-          <w:numId w:val="1001"/>
+          <w:numId w:val="1002"/>
         </w:numPr>
       </w:pPr>
       <w:r>
@@ -207,7 +419,7 @@
       <w:pPr>
         <w:numPr>
           <w:ilvl w:val="0"/>
-          <w:numId w:val="1001"/>
+          <w:numId w:val="1002"/>
         </w:numPr>
       </w:pPr>
       <w:r>
@@ -218,7 +430,7 @@
       <w:pPr>
         <w:numPr>
           <w:ilvl w:val="0"/>
-          <w:numId w:val="1001"/>
+          <w:numId w:val="1002"/>
         </w:numPr>
       </w:pPr>
       <w:r>
@@ -229,7 +441,7 @@
       <w:pPr>
         <w:numPr>
           <w:ilvl w:val="0"/>
-          <w:numId w:val="1001"/>
+          <w:numId w:val="1002"/>
         </w:numPr>
       </w:pPr>
       <w:r>
@@ -240,7 +452,7 @@
       <w:pPr>
         <w:numPr>
           <w:ilvl w:val="0"/>
-          <w:numId w:val="1001"/>
+          <w:numId w:val="1002"/>
         </w:numPr>
       </w:pPr>
       <w:r>
@@ -251,7 +463,7 @@
       <w:pPr>
         <w:numPr>
           <w:ilvl w:val="0"/>
-          <w:numId w:val="1001"/>
+          <w:numId w:val="1002"/>
         </w:numPr>
       </w:pPr>
       <w:r>
@@ -355,32 +567,11 @@
       <w:pPr>
         <w:numPr>
           <w:ilvl w:val="0"/>
-          <w:numId w:val="1002"/>
+          <w:numId w:val="1003"/>
         </w:numPr>
       </w:pPr>
       <w:r>
         <w:t xml:space="preserve">In general, are higher or lower HDIs associated with higher prevalence of MSVI?</w:t>
-      </w:r>
-    </w:p>
-    <w:p>
-      <w:pPr>
-        <w:numPr>
-          <w:ilvl w:val="0"/>
-          <w:numId w:val="1002"/>
-        </w:numPr>
-      </w:pPr>
-      <w:r>
-        <w:t xml:space="preserve">Among China, India, Pakistan, Nigeria, and Indonesia, which has the lowest HDI?</w:t>
-      </w:r>
-    </w:p>
-    <w:bookmarkEnd w:id="20"/>
-    <w:bookmarkStart w:id="21" w:name="exercise-3"/>
-    <w:p>
-      <w:pPr>
-        <w:pStyle w:val="Heading2"/>
-      </w:pPr>
-      <w:r>
-        <w:t xml:space="preserve">Exercise 3</w:t>
       </w:r>
     </w:p>
     <w:p>
@@ -391,44 +582,17 @@
         </w:numPr>
       </w:pPr>
       <w:r>
-        <w:t xml:space="preserve">Does India have higher or lower prevalence of MSVI than might be expected given its HDI?</w:t>
-      </w:r>
-    </w:p>
-    <w:p>
-      <w:pPr>
-        <w:numPr>
-          <w:ilvl w:val="0"/>
-          <w:numId w:val="1003"/>
-        </w:numPr>
-      </w:pPr>
-      <w:r>
-        <w:t xml:space="preserve">In their conclusion, the authors state “Burden of visual impairment and socioeconomic indicators were closely associated and may help to identify countries requiring greater attention to these issues.” Do you think this is a reasonable statement to make from the scatterplot? Why or why not?</w:t>
-      </w:r>
-    </w:p>
-    <w:bookmarkEnd w:id="21"/>
-    <w:bookmarkStart w:id="22" w:name="exercise-4-seer-data"/>
+        <w:t xml:space="preserve">Among China, India, Pakistan, Nigeria, and Indonesia, which has the lowest HDI?</w:t>
+      </w:r>
+    </w:p>
+    <w:bookmarkEnd w:id="20"/>
+    <w:bookmarkStart w:id="21" w:name="exercise-3"/>
     <w:p>
       <w:pPr>
         <w:pStyle w:val="Heading2"/>
       </w:pPr>
       <w:r>
-        <w:t xml:space="preserve">Exercise 4: SEER Data</w:t>
-      </w:r>
-    </w:p>
-    <w:p>
-      <w:pPr>
-        <w:pStyle w:val="FirstParagraph"/>
-      </w:pPr>
-      <w:r>
-        <w:t xml:space="preserve">According to data from the Surveillance, Epidemiology, and End Results (SEER) Program of the National Cancer Institute, U.S. women have approximately a 1 in 8 lifetime chance (12.5%) of developing breast cancer.</w:t>
-      </w:r>
-    </w:p>
-    <w:p>
-      <w:pPr>
-        <w:pStyle w:val="BodyText"/>
-      </w:pPr>
-      <w:r>
-        <w:t xml:space="preserve">Please provide a numerical answer by using R’s calculator capability (i.e., insert new R chunks, show code calculating the numeric answers). Be careful with parentheses! In addition, provide a 1-sentence explanation of your work.</w:t>
+        <w:t xml:space="preserve">Exercise 3</w:t>
       </w:r>
     </w:p>
     <w:p>
@@ -439,7 +603,7 @@
         </w:numPr>
       </w:pPr>
       <w:r>
-        <w:t xml:space="preserve">Suppose three unrelated women are randomly selected from the U.S. population. What is the probability that all three will develop breast cancer at some point during their lives?</w:t>
+        <w:t xml:space="preserve">Does India have higher or lower prevalence of MSVI than might be expected given its HDI?</w:t>
       </w:r>
     </w:p>
     <w:p>
@@ -447,6 +611,54 @@
         <w:numPr>
           <w:ilvl w:val="0"/>
           <w:numId w:val="1004"/>
+        </w:numPr>
+      </w:pPr>
+      <w:r>
+        <w:t xml:space="preserve">In their conclusion, the authors state “Burden of visual impairment and socioeconomic indicators were closely associated and may help to identify countries requiring greater attention to these issues.” Do you think this is a reasonable statement to make from the scatterplot? Why or why not?</w:t>
+      </w:r>
+    </w:p>
+    <w:bookmarkEnd w:id="21"/>
+    <w:bookmarkStart w:id="22" w:name="exercise-4-seer-data"/>
+    <w:p>
+      <w:pPr>
+        <w:pStyle w:val="Heading2"/>
+      </w:pPr>
+      <w:r>
+        <w:t xml:space="preserve">Exercise 4: SEER Data</w:t>
+      </w:r>
+    </w:p>
+    <w:p>
+      <w:pPr>
+        <w:pStyle w:val="FirstParagraph"/>
+      </w:pPr>
+      <w:r>
+        <w:t xml:space="preserve">According to data from the Surveillance, Epidemiology, and End Results (SEER) Program of the National Cancer Institute, U.S. women have approximately a 1 in 8 lifetime chance (12.5%) of developing breast cancer.</w:t>
+      </w:r>
+    </w:p>
+    <w:p>
+      <w:pPr>
+        <w:pStyle w:val="BodyText"/>
+      </w:pPr>
+      <w:r>
+        <w:t xml:space="preserve">Please provide a numerical answer by using R’s calculator capability (i.e., insert new R chunks, show code calculating the numeric answers). Be careful with parentheses! In addition, provide a 1-sentence explanation of your work.</w:t>
+      </w:r>
+    </w:p>
+    <w:p>
+      <w:pPr>
+        <w:numPr>
+          <w:ilvl w:val="0"/>
+          <w:numId w:val="1005"/>
+        </w:numPr>
+      </w:pPr>
+      <w:r>
+        <w:t xml:space="preserve">Suppose three unrelated women are randomly selected from the U.S. population. What is the probability that all three will develop breast cancer at some point during their lives?</w:t>
+      </w:r>
+    </w:p>
+    <w:p>
+      <w:pPr>
+        <w:numPr>
+          <w:ilvl w:val="0"/>
+          <w:numId w:val="1005"/>
         </w:numPr>
       </w:pPr>
       <w:r>
@@ -531,7 +743,7 @@
       <w:pPr>
         <w:numPr>
           <w:ilvl w:val="0"/>
-          <w:numId w:val="1005"/>
+          <w:numId w:val="1006"/>
         </w:numPr>
       </w:pPr>
       <w:r>
@@ -542,7 +754,7 @@
       <w:pPr>
         <w:numPr>
           <w:ilvl w:val="0"/>
-          <w:numId w:val="1005"/>
+          <w:numId w:val="1006"/>
         </w:numPr>
       </w:pPr>
       <w:r>
@@ -553,7 +765,7 @@
       <w:pPr>
         <w:numPr>
           <w:ilvl w:val="0"/>
-          <w:numId w:val="1005"/>
+          <w:numId w:val="1006"/>
         </w:numPr>
       </w:pPr>
       <w:r>
@@ -564,7 +776,7 @@
       <w:pPr>
         <w:numPr>
           <w:ilvl w:val="0"/>
-          <w:numId w:val="1005"/>
+          <w:numId w:val="1006"/>
         </w:numPr>
       </w:pPr>
       <w:r>
@@ -894,6 +1106,109 @@
       </w:pPr>
     </w:lvl>
   </w:abstractNum>
+  <w:abstractNum w:abstractNumId="991">
+    <w:nsid w:val="0000A991"/>
+    <w:multiLevelType w:val="multilevel"/>
+    <w:lvl w:ilvl="0">
+      <w:numFmt w:val="bullet"/>
+      <w:lvlText w:val=""/>
+      <w:lvlJc w:val="left"/>
+      <w:pPr>
+        <w:ind w:left="720" w:hanging="360"/>
+      </w:pPr>
+      <w:rPr>
+        <w:rFonts w:ascii="Symbol" w:hAnsi="Symbol" w:cs="Symbol" w:hint="default"/>
+      </w:rPr>
+    </w:lvl>
+    <w:lvl w:ilvl="1">
+      <w:numFmt w:val="bullet"/>
+      <w:lvlText w:val="o"/>
+      <w:lvlJc w:val="left"/>
+      <w:pPr>
+        <w:ind w:left="1440" w:hanging="360"/>
+      </w:pPr>
+      <w:rPr>
+        <w:rFonts w:ascii="Courier New" w:hAnsi="Courier New" w:cs="Courier New" w:hint="default"/>
+      </w:rPr>
+    </w:lvl>
+    <w:lvl w:ilvl="2">
+      <w:numFmt w:val="bullet"/>
+      <w:lvlText w:val=""/>
+      <w:lvlJc w:val="left"/>
+      <w:pPr>
+        <w:ind w:left="2160" w:hanging="360"/>
+      </w:pPr>
+      <w:rPr>
+        <w:rFonts w:ascii="Wingdings" w:hAnsi="Wingdings" w:cs="Wingdings" w:hint="default"/>
+      </w:rPr>
+    </w:lvl>
+    <w:lvl w:ilvl="3">
+      <w:numFmt w:val="bullet"/>
+      <w:lvlText w:val=""/>
+      <w:lvlJc w:val="left"/>
+      <w:pPr>
+        <w:ind w:left="2880" w:hanging="360"/>
+      </w:pPr>
+      <w:rPr>
+        <w:rFonts w:ascii="Symbol" w:hAnsi="Symbol" w:cs="Symbol" w:hint="default"/>
+      </w:rPr>
+    </w:lvl>
+    <w:lvl w:ilvl="4">
+      <w:numFmt w:val="bullet"/>
+      <w:lvlText w:val="o"/>
+      <w:lvlJc w:val="left"/>
+      <w:pPr>
+        <w:ind w:left="3600" w:hanging="360"/>
+      </w:pPr>
+      <w:rPr>
+        <w:rFonts w:ascii="Courier New" w:hAnsi="Courier New" w:cs="Courier New" w:hint="default"/>
+      </w:rPr>
+    </w:lvl>
+    <w:lvl w:ilvl="5">
+      <w:numFmt w:val="bullet"/>
+      <w:lvlText w:val=""/>
+      <w:lvlJc w:val="left"/>
+      <w:pPr>
+        <w:ind w:left="4320" w:hanging="360"/>
+      </w:pPr>
+      <w:rPr>
+        <w:rFonts w:ascii="Wingdings" w:hAnsi="Wingdings" w:cs="Wingdings" w:hint="default"/>
+      </w:rPr>
+    </w:lvl>
+    <w:lvl w:ilvl="6">
+      <w:numFmt w:val="bullet"/>
+      <w:lvlText w:val=""/>
+      <w:lvlJc w:val="left"/>
+      <w:pPr>
+        <w:ind w:left="5040" w:hanging="360"/>
+      </w:pPr>
+      <w:rPr>
+        <w:rFonts w:ascii="Symbol" w:hAnsi="Symbol" w:cs="Symbol" w:hint="default"/>
+      </w:rPr>
+    </w:lvl>
+    <w:lvl w:ilvl="7">
+      <w:numFmt w:val="bullet"/>
+      <w:lvlText w:val="o"/>
+      <w:lvlJc w:val="left"/>
+      <w:pPr>
+        <w:ind w:left="5760" w:hanging="360"/>
+      </w:pPr>
+      <w:rPr>
+        <w:rFonts w:ascii="Courier New" w:hAnsi="Courier New" w:cs="Courier New" w:hint="default"/>
+      </w:rPr>
+    </w:lvl>
+    <w:lvl w:ilvl="8">
+      <w:numFmt w:val="bullet"/>
+      <w:lvlText w:val=""/>
+      <w:lvlJc w:val="left"/>
+      <w:pPr>
+        <w:ind w:left="6480" w:hanging="360"/>
+      </w:pPr>
+      <w:rPr>
+        <w:rFonts w:ascii="Wingdings" w:hAnsi="Wingdings" w:cs="Wingdings" w:hint="default"/>
+      </w:rPr>
+    </w:lvl>
+  </w:abstractNum>
   <w:abstractNum w:abstractNumId="99711">
     <w:nsid w:val="00A99711"/>
     <w:multiLevelType w:val="multilevel"/>
@@ -979,141 +1294,11 @@
       </w:pPr>
     </w:lvl>
   </w:abstractNum>
-  <w:abstractNum w:abstractNumId="991">
-    <w:nsid w:val="0000A991"/>
-    <w:multiLevelType w:val="multilevel"/>
-    <w:lvl w:ilvl="0">
-      <w:numFmt w:val="bullet"/>
-      <w:lvlText w:val=""/>
-      <w:lvlJc w:val="left"/>
-      <w:pPr>
-        <w:ind w:left="720" w:hanging="360"/>
-      </w:pPr>
-      <w:rPr>
-        <w:rFonts w:ascii="Symbol" w:hAnsi="Symbol" w:cs="Symbol" w:hint="default"/>
-      </w:rPr>
-    </w:lvl>
-    <w:lvl w:ilvl="1">
-      <w:numFmt w:val="bullet"/>
-      <w:lvlText w:val="o"/>
-      <w:lvlJc w:val="left"/>
-      <w:pPr>
-        <w:ind w:left="1440" w:hanging="360"/>
-      </w:pPr>
-      <w:rPr>
-        <w:rFonts w:ascii="Courier New" w:hAnsi="Courier New" w:cs="Courier New" w:hint="default"/>
-      </w:rPr>
-    </w:lvl>
-    <w:lvl w:ilvl="2">
-      <w:numFmt w:val="bullet"/>
-      <w:lvlText w:val=""/>
-      <w:lvlJc w:val="left"/>
-      <w:pPr>
-        <w:ind w:left="2160" w:hanging="360"/>
-      </w:pPr>
-      <w:rPr>
-        <w:rFonts w:ascii="Wingdings" w:hAnsi="Wingdings" w:cs="Wingdings" w:hint="default"/>
-      </w:rPr>
-    </w:lvl>
-    <w:lvl w:ilvl="3">
-      <w:numFmt w:val="bullet"/>
-      <w:lvlText w:val=""/>
-      <w:lvlJc w:val="left"/>
-      <w:pPr>
-        <w:ind w:left="2880" w:hanging="360"/>
-      </w:pPr>
-      <w:rPr>
-        <w:rFonts w:ascii="Symbol" w:hAnsi="Symbol" w:cs="Symbol" w:hint="default"/>
-      </w:rPr>
-    </w:lvl>
-    <w:lvl w:ilvl="4">
-      <w:numFmt w:val="bullet"/>
-      <w:lvlText w:val="o"/>
-      <w:lvlJc w:val="left"/>
-      <w:pPr>
-        <w:ind w:left="3600" w:hanging="360"/>
-      </w:pPr>
-      <w:rPr>
-        <w:rFonts w:ascii="Courier New" w:hAnsi="Courier New" w:cs="Courier New" w:hint="default"/>
-      </w:rPr>
-    </w:lvl>
-    <w:lvl w:ilvl="5">
-      <w:numFmt w:val="bullet"/>
-      <w:lvlText w:val=""/>
-      <w:lvlJc w:val="left"/>
-      <w:pPr>
-        <w:ind w:left="4320" w:hanging="360"/>
-      </w:pPr>
-      <w:rPr>
-        <w:rFonts w:ascii="Wingdings" w:hAnsi="Wingdings" w:cs="Wingdings" w:hint="default"/>
-      </w:rPr>
-    </w:lvl>
-    <w:lvl w:ilvl="6">
-      <w:numFmt w:val="bullet"/>
-      <w:lvlText w:val=""/>
-      <w:lvlJc w:val="left"/>
-      <w:pPr>
-        <w:ind w:left="5040" w:hanging="360"/>
-      </w:pPr>
-      <w:rPr>
-        <w:rFonts w:ascii="Symbol" w:hAnsi="Symbol" w:cs="Symbol" w:hint="default"/>
-      </w:rPr>
-    </w:lvl>
-    <w:lvl w:ilvl="7">
-      <w:numFmt w:val="bullet"/>
-      <w:lvlText w:val="o"/>
-      <w:lvlJc w:val="left"/>
-      <w:pPr>
-        <w:ind w:left="5760" w:hanging="360"/>
-      </w:pPr>
-      <w:rPr>
-        <w:rFonts w:ascii="Courier New" w:hAnsi="Courier New" w:cs="Courier New" w:hint="default"/>
-      </w:rPr>
-    </w:lvl>
-    <w:lvl w:ilvl="8">
-      <w:numFmt w:val="bullet"/>
-      <w:lvlText w:val=""/>
-      <w:lvlJc w:val="left"/>
-      <w:pPr>
-        <w:ind w:left="6480" w:hanging="360"/>
-      </w:pPr>
-      <w:rPr>
-        <w:rFonts w:ascii="Wingdings" w:hAnsi="Wingdings" w:cs="Wingdings" w:hint="default"/>
-      </w:rPr>
-    </w:lvl>
-  </w:abstractNum>
   <w:num w:numId="1000">
     <w:abstractNumId w:val="990"/>
   </w:num>
   <w:num w:numId="1001">
-    <w:abstractNumId w:val="99711"/>
-    <w:lvlOverride w:ilvl="0">
-      <w:startOverride w:val="1"/>
-    </w:lvlOverride>
-    <w:lvlOverride w:ilvl="1">
-      <w:startOverride w:val="1"/>
-    </w:lvlOverride>
-    <w:lvlOverride w:ilvl="2">
-      <w:startOverride w:val="1"/>
-    </w:lvlOverride>
-    <w:lvlOverride w:ilvl="3">
-      <w:startOverride w:val="1"/>
-    </w:lvlOverride>
-    <w:lvlOverride w:ilvl="4">
-      <w:startOverride w:val="1"/>
-    </w:lvlOverride>
-    <w:lvlOverride w:ilvl="5">
-      <w:startOverride w:val="1"/>
-    </w:lvlOverride>
-    <w:lvlOverride w:ilvl="6">
-      <w:startOverride w:val="1"/>
-    </w:lvlOverride>
-    <w:lvlOverride w:ilvl="7">
-      <w:startOverride w:val="1"/>
-    </w:lvlOverride>
-    <w:lvlOverride w:ilvl="8">
-      <w:startOverride w:val="1"/>
-    </w:lvlOverride>
+    <w:abstractNumId w:val="991"/>
   </w:num>
   <w:num w:numId="1002">
     <w:abstractNumId w:val="99711"/>
@@ -1206,6 +1391,36 @@
     </w:lvlOverride>
   </w:num>
   <w:num w:numId="1005">
+    <w:abstractNumId w:val="99711"/>
+    <w:lvlOverride w:ilvl="0">
+      <w:startOverride w:val="1"/>
+    </w:lvlOverride>
+    <w:lvlOverride w:ilvl="1">
+      <w:startOverride w:val="1"/>
+    </w:lvlOverride>
+    <w:lvlOverride w:ilvl="2">
+      <w:startOverride w:val="1"/>
+    </w:lvlOverride>
+    <w:lvlOverride w:ilvl="3">
+      <w:startOverride w:val="1"/>
+    </w:lvlOverride>
+    <w:lvlOverride w:ilvl="4">
+      <w:startOverride w:val="1"/>
+    </w:lvlOverride>
+    <w:lvlOverride w:ilvl="5">
+      <w:startOverride w:val="1"/>
+    </w:lvlOverride>
+    <w:lvlOverride w:ilvl="6">
+      <w:startOverride w:val="1"/>
+    </w:lvlOverride>
+    <w:lvlOverride w:ilvl="7">
+      <w:startOverride w:val="1"/>
+    </w:lvlOverride>
+    <w:lvlOverride w:ilvl="8">
+      <w:startOverride w:val="1"/>
+    </w:lvlOverride>
+  </w:num>
+  <w:num w:numId="1006">
     <w:abstractNumId w:val="991"/>
   </w:num>
 </w:numbering>

</xml_diff>